<commit_message>
Agregar la guía de mediciones y verificaciones
Un documento con todo lo que hay que medir y comprobar, en orden: Bloque A
con el telar apagado y encendido, sensor de pasada, lectores ópticos y
relés LCA110, registro de valores y ajustes de config.h. Corrige además las
patas del LCA110 en la guía C y D y el modelo del telar en la de los LCA110.

Co-Authored-By: Claude Opus 5.5 <noreply@anthropic.com>
Claude-Session: https://claude.ai/code/session_01QiY8ZZNAM9gwPKiqSkCaaj
</commit_message>
<xml_diff>
--- a/documentacion_proyecto/Guia_Bloques_C_y_D.docx
+++ b/documentacion_proyecto/Guia_Bloques_C_y_D.docx
@@ -1792,7 +1792,7 @@
           <w:sz w:val="22"/>
           <w:szCs w:val="22"/>
         </w:rPr>
-        <w:t xml:space="preserve">Patas 3 y 4, la salida: </w:t>
+        <w:t xml:space="preserve">Patas 4 y 6, la salida (la 3 y la 5 quedan sin conectar): </w:t>
       </w:r>
       <w:r>
         <w:rPr>
@@ -2016,7 +2016,7 @@
           <w:sz w:val="22"/>
           <w:szCs w:val="22"/>
         </w:rPr>
-        <w:t xml:space="preserve">En cualquiera de los dos casos hay que cortar uno de los hilos del lector para intercalar el relé, o derivar de sus terminales.</w:t>
+        <w:t xml:space="preserve">En paralelo no se corta nada: las patas 4 y 6 van a los dos terminales del lector. En serie hay que cortar uno de los hilos para intercalar el relé.</w:t>
       </w:r>
     </w:p>
     <w:p>
@@ -2121,7 +2121,7 @@
           <w:sz w:val="22"/>
           <w:szCs w:val="22"/>
         </w:rPr>
-        <w:t xml:space="preserve">Patas 3 y 4 del relé a los dos hilos del lector óptico, en serie o en paralelo según la medición.</w:t>
+        <w:t xml:space="preserve">Patas 4 y 6 del relé a los dos hilos del lector óptico, en serie o en paralelo según la medición.</w:t>
       </w:r>
     </w:p>
     <w:p>
@@ -2196,7 +2196,7 @@
           <w:sz w:val="22"/>
           <w:szCs w:val="22"/>
         </w:rPr>
-        <w:t xml:space="preserve">Conectar un único lector y verificar que el sistema pueda reproducir lo que hace el papel. Recién cuando ese canal funcione, sumar los otros dos.</w:t>
+        <w:t xml:space="preserve">Conectar un único lector y verificar que el sistema pueda reproducir lo que hace el papel. Recién cuando ese canal funcione, sumar los otros tres.</w:t>
       </w:r>
     </w:p>
     <w:p>

</xml_diff>